<commit_message>
docs: update MD tutorial now that reviewer chain and scoring rules are live (Phase 7)
</commit_message>
<xml_diff>
--- a/docs/Appraisal_Templates_MD_Guide.docx
+++ b/docs/Appraisal_Templates_MD_Guide.docx
@@ -586,7 +586,7 @@
           <w:sz w:val="26"/>
           <w:szCs w:val="26"/>
         </w:rPr>
-        <w:t xml:space="preserve">Step 6 — Save</w:t>
+        <w:t xml:space="preserve">Step 6 — Choose the Reviewer Chain</w:t>
       </w:r>
     </w:p>
     <w:p>
@@ -598,7 +598,160 @@
           <w:sz w:val="22"/>
           <w:szCs w:val="22"/>
         </w:rPr>
-        <w:t xml:space="preserve">Click "Create Template" (or "Update Template" if one already exists for this department). That's it — the template is now live for the next appraisal cycle.</w:t>
+        <w:t xml:space="preserve">Decide which review stages this department's appraisals go through, beyond the Self-Review that always happens first and the Final MD Sign-off that always happens last:</w:t>
+      </w:r>
+    </w:p>
+    <w:p>
+      <w:pPr>
+        <w:pStyle w:val="ListParagraph"/>
+        <w:numPr>
+          <w:ilvl w:val="0"/>
+          <w:numId w:val="2"/>
+        </w:numPr>
+        <w:spacing w:after="100"/>
+      </w:pPr>
+      <w:r>
+        <w:rPr>
+          <w:sz w:val="22"/>
+          <w:szCs w:val="22"/>
+        </w:rPr>
+        <w:t xml:space="preserve">Require Manager Review — on by default. Turn off only if this department reports directly to you with no line manager step.</w:t>
+      </w:r>
+    </w:p>
+    <w:p>
+      <w:pPr>
+        <w:pStyle w:val="ListParagraph"/>
+        <w:numPr>
+          <w:ilvl w:val="0"/>
+          <w:numId w:val="2"/>
+        </w:numPr>
+        <w:spacing w:after="100"/>
+      </w:pPr>
+      <w:r>
+        <w:rPr>
+          <w:sz w:val="22"/>
+          <w:szCs w:val="22"/>
+        </w:rPr>
+        <w:t xml:space="preserve">Require Department Head Review — turn on to insert a department-head sign-off between the manager and HR/final stages.</w:t>
+      </w:r>
+    </w:p>
+    <w:p>
+      <w:pPr>
+        <w:pStyle w:val="ListParagraph"/>
+        <w:numPr>
+          <w:ilvl w:val="0"/>
+          <w:numId w:val="2"/>
+        </w:numPr>
+        <w:spacing w:after="100"/>
+      </w:pPr>
+      <w:r>
+        <w:rPr>
+          <w:sz w:val="22"/>
+          <w:szCs w:val="22"/>
+        </w:rPr>
+        <w:t xml:space="preserve">Require HR Review — turn on to insert an HR check before your final sign-off.</w:t>
+      </w:r>
+    </w:p>
+    <w:p>
+      <w:pPr>
+        <w:spacing w:after="160"/>
+      </w:pPr>
+      <w:r>
+        <w:rPr>
+          <w:sz w:val="22"/>
+          <w:szCs w:val="22"/>
+        </w:rPr>
+        <w:t xml:space="preserve">Whatever you enable here becomes the actual path the appraisal follows — the employee, their manager, the department head, and HR will each see the packet appear in their queue only for the stage that applies to them.</w:t>
+      </w:r>
+    </w:p>
+    <w:p>
+      <w:pPr>
+        <w:pStyle w:val="Heading2"/>
+        <w:spacing w:after="150" w:before="300"/>
+      </w:pPr>
+      <w:r>
+        <w:rPr>
+          <w:b/>
+          <w:bCs/>
+          <w:color w:val="1F4E78"/>
+          <w:sz w:val="26"/>
+          <w:szCs w:val="26"/>
+        </w:rPr>
+        <w:t xml:space="preserve">Step 7 — Set the Scoring Rules</w:t>
+      </w:r>
+    </w:p>
+    <w:p>
+      <w:pPr>
+        <w:spacing w:after="160"/>
+      </w:pPr>
+      <w:r>
+        <w:rPr>
+          <w:sz w:val="22"/>
+          <w:szCs w:val="22"/>
+        </w:rPr>
+        <w:t xml:space="preserve">Two more settings control how the final score is calculated:</w:t>
+      </w:r>
+    </w:p>
+    <w:p>
+      <w:pPr>
+        <w:pStyle w:val="ListParagraph"/>
+        <w:numPr>
+          <w:ilvl w:val="0"/>
+          <w:numId w:val="2"/>
+        </w:numPr>
+        <w:spacing w:after="100"/>
+      </w:pPr>
+      <w:r>
+        <w:rPr>
+          <w:sz w:val="22"/>
+          <w:szCs w:val="22"/>
+        </w:rPr>
+        <w:t xml:space="preserve">Self/Manager Balance — how much weight the employee's own self-review score carries versus their manager's assessment when the system suggests a final score. The default is 20% self / 80% manager; adjust the slider if this department should weigh things differently.</w:t>
+      </w:r>
+    </w:p>
+    <w:p>
+      <w:pPr>
+        <w:pStyle w:val="ListParagraph"/>
+        <w:numPr>
+          <w:ilvl w:val="0"/>
+          <w:numId w:val="2"/>
+        </w:numPr>
+        <w:spacing w:after="100"/>
+      </w:pPr>
+      <w:r>
+        <w:rPr>
+          <w:sz w:val="22"/>
+          <w:szCs w:val="22"/>
+        </w:rPr>
+        <w:t xml:space="preserve">Gap Alert Threshold — how many points of difference between the self-review score and the manager's score triggers a flag for your attention (default: 15 points).</w:t>
+      </w:r>
+    </w:p>
+    <w:p>
+      <w:pPr>
+        <w:pStyle w:val="Heading2"/>
+        <w:spacing w:after="150" w:before="300"/>
+      </w:pPr>
+      <w:r>
+        <w:rPr>
+          <w:b/>
+          <w:bCs/>
+          <w:color w:val="1F4E78"/>
+          <w:sz w:val="26"/>
+          <w:szCs w:val="26"/>
+        </w:rPr>
+        <w:t xml:space="preserve">Step 8 — Save</w:t>
+      </w:r>
+    </w:p>
+    <w:p>
+      <w:pPr>
+        <w:spacing w:after="160"/>
+      </w:pPr>
+      <w:r>
+        <w:rPr>
+          <w:sz w:val="22"/>
+          <w:szCs w:val="22"/>
+        </w:rPr>
+        <w:t xml:space="preserve">Click "Create Template" (or "Update Template" if one already exists for this department). That's it — the template, its reviewer chain, and its scoring rules are all live for the next appraisal cycle.</w:t>
       </w:r>
     </w:p>
     <w:p>
@@ -686,6 +839,57 @@
           <w:szCs w:val="22"/>
         </w:rPr>
         <w:t xml:space="preserve">The system calculates each question's score using your weighting, then averages up to a KPI score, then to an overall score — automatically.</w:t>
+      </w:r>
+    </w:p>
+    <w:p>
+      <w:pPr>
+        <w:pStyle w:val="ListParagraph"/>
+        <w:numPr>
+          <w:ilvl w:val="0"/>
+          <w:numId w:val="3"/>
+        </w:numPr>
+        <w:spacing w:after="140"/>
+      </w:pPr>
+      <w:r>
+        <w:rPr>
+          <w:sz w:val="22"/>
+          <w:szCs w:val="22"/>
+        </w:rPr>
+        <w:t xml:space="preserve">The appraisal is routed through exactly the reviewer stages you enabled — Manager, then Department Head and/or HR if turned on, then your final sign-off.</w:t>
+      </w:r>
+    </w:p>
+    <w:p>
+      <w:pPr>
+        <w:pStyle w:val="ListParagraph"/>
+        <w:numPr>
+          <w:ilvl w:val="0"/>
+          <w:numId w:val="3"/>
+        </w:numPr>
+        <w:spacing w:after="140"/>
+      </w:pPr>
+      <w:r>
+        <w:rPr>
+          <w:sz w:val="22"/>
+          <w:szCs w:val="22"/>
+        </w:rPr>
+        <w:t xml:space="preserve">If the self-review and manager scores differ by more than your gap threshold, the packet is flagged for your attention.</w:t>
+      </w:r>
+    </w:p>
+    <w:p>
+      <w:pPr>
+        <w:pStyle w:val="ListParagraph"/>
+        <w:numPr>
+          <w:ilvl w:val="0"/>
+          <w:numId w:val="3"/>
+        </w:numPr>
+        <w:spacing w:after="140"/>
+      </w:pPr>
+      <w:r>
+        <w:rPr>
+          <w:sz w:val="22"/>
+          <w:szCs w:val="22"/>
+        </w:rPr>
+        <w:t xml:space="preserve">When you finalize the appraisal, the suggested final score reflects the self/manager balance you set for that department — not a fixed 20/80 split.</w:t>
       </w:r>
     </w:p>
     <w:p>
@@ -712,7 +916,7 @@
           <w:sz w:val="21"/>
           <w:szCs w:val="21"/>
         </w:rPr>
-        <w:t xml:space="preserve">A template only applies to appraisal cycles started after it's created. Employees already mid-cycle when you save a template will finish their current appraisal on the old question set — this protects appraisals already in progress from being disrupted.</w:t>
+        <w:t xml:space="preserve">A template only applies to appraisal cycles started after it's created. Employees already mid-cycle when you save a template will finish their current appraisal on the old rules — this protects appraisals already in progress from being disrupted.</w:t>
       </w:r>
     </w:p>
     <w:p>
@@ -728,35 +932,7 @@
           <w:sz w:val="32"/>
           <w:szCs w:val="32"/>
         </w:rPr>
-        <w:t xml:space="preserve">5. What's Not Live Yet</w:t>
-      </w:r>
-    </w:p>
-    <w:p>
-      <w:pPr>
-        <w:spacing w:after="160"/>
-      </w:pPr>
-      <w:r>
-        <w:rPr>
-          <w:sz w:val="22"/>
-          <w:szCs w:val="22"/>
-        </w:rPr>
-        <w:t xml:space="preserve">You'll notice a few additional settings in the builder — Reviewer Chain toggles (Manager/Department Head/HR review), the self-review vs. manager-review score balance slider, and the gap alert threshold. These are saved when you click save, but they don't yet change how appraisals are routed or scored — that part of the system is still being built. For now, focus on the KPIs and questions, which are fully live.</w:t>
-      </w:r>
-    </w:p>
-    <w:p>
-      <w:pPr>
-        <w:pStyle w:val="Heading1"/>
-        <w:spacing w:after="200" w:before="400"/>
-      </w:pPr>
-      <w:r>
-        <w:rPr>
-          <w:b/>
-          <w:bCs/>
-          <w:color w:val="1F4E78"/>
-          <w:sz w:val="32"/>
-          <w:szCs w:val="32"/>
-        </w:rPr>
-        <w:t xml:space="preserve">6. Recommended First Steps</w:t>
+        <w:t xml:space="preserve">5. Recommended First Steps</w:t>
       </w:r>
     </w:p>
     <w:p>

</xml_diff>

<commit_message>
docs: update MD tutorial now that reviewer chain and scoring rules are live (Phase 7) (#27)
</commit_message>
<xml_diff>
--- a/docs/Appraisal_Templates_MD_Guide.docx
+++ b/docs/Appraisal_Templates_MD_Guide.docx
@@ -586,7 +586,7 @@
           <w:sz w:val="26"/>
           <w:szCs w:val="26"/>
         </w:rPr>
-        <w:t xml:space="preserve">Step 6 — Save</w:t>
+        <w:t xml:space="preserve">Step 6 — Choose the Reviewer Chain</w:t>
       </w:r>
     </w:p>
     <w:p>
@@ -598,7 +598,160 @@
           <w:sz w:val="22"/>
           <w:szCs w:val="22"/>
         </w:rPr>
-        <w:t xml:space="preserve">Click "Create Template" (or "Update Template" if one already exists for this department). That's it — the template is now live for the next appraisal cycle.</w:t>
+        <w:t xml:space="preserve">Decide which review stages this department's appraisals go through, beyond the Self-Review that always happens first and the Final MD Sign-off that always happens last:</w:t>
+      </w:r>
+    </w:p>
+    <w:p>
+      <w:pPr>
+        <w:pStyle w:val="ListParagraph"/>
+        <w:numPr>
+          <w:ilvl w:val="0"/>
+          <w:numId w:val="2"/>
+        </w:numPr>
+        <w:spacing w:after="100"/>
+      </w:pPr>
+      <w:r>
+        <w:rPr>
+          <w:sz w:val="22"/>
+          <w:szCs w:val="22"/>
+        </w:rPr>
+        <w:t xml:space="preserve">Require Manager Review — on by default. Turn off only if this department reports directly to you with no line manager step.</w:t>
+      </w:r>
+    </w:p>
+    <w:p>
+      <w:pPr>
+        <w:pStyle w:val="ListParagraph"/>
+        <w:numPr>
+          <w:ilvl w:val="0"/>
+          <w:numId w:val="2"/>
+        </w:numPr>
+        <w:spacing w:after="100"/>
+      </w:pPr>
+      <w:r>
+        <w:rPr>
+          <w:sz w:val="22"/>
+          <w:szCs w:val="22"/>
+        </w:rPr>
+        <w:t xml:space="preserve">Require Department Head Review — turn on to insert a department-head sign-off between the manager and HR/final stages.</w:t>
+      </w:r>
+    </w:p>
+    <w:p>
+      <w:pPr>
+        <w:pStyle w:val="ListParagraph"/>
+        <w:numPr>
+          <w:ilvl w:val="0"/>
+          <w:numId w:val="2"/>
+        </w:numPr>
+        <w:spacing w:after="100"/>
+      </w:pPr>
+      <w:r>
+        <w:rPr>
+          <w:sz w:val="22"/>
+          <w:szCs w:val="22"/>
+        </w:rPr>
+        <w:t xml:space="preserve">Require HR Review — turn on to insert an HR check before your final sign-off.</w:t>
+      </w:r>
+    </w:p>
+    <w:p>
+      <w:pPr>
+        <w:spacing w:after="160"/>
+      </w:pPr>
+      <w:r>
+        <w:rPr>
+          <w:sz w:val="22"/>
+          <w:szCs w:val="22"/>
+        </w:rPr>
+        <w:t xml:space="preserve">Whatever you enable here becomes the actual path the appraisal follows — the employee, their manager, the department head, and HR will each see the packet appear in their queue only for the stage that applies to them.</w:t>
+      </w:r>
+    </w:p>
+    <w:p>
+      <w:pPr>
+        <w:pStyle w:val="Heading2"/>
+        <w:spacing w:after="150" w:before="300"/>
+      </w:pPr>
+      <w:r>
+        <w:rPr>
+          <w:b/>
+          <w:bCs/>
+          <w:color w:val="1F4E78"/>
+          <w:sz w:val="26"/>
+          <w:szCs w:val="26"/>
+        </w:rPr>
+        <w:t xml:space="preserve">Step 7 — Set the Scoring Rules</w:t>
+      </w:r>
+    </w:p>
+    <w:p>
+      <w:pPr>
+        <w:spacing w:after="160"/>
+      </w:pPr>
+      <w:r>
+        <w:rPr>
+          <w:sz w:val="22"/>
+          <w:szCs w:val="22"/>
+        </w:rPr>
+        <w:t xml:space="preserve">Two more settings control how the final score is calculated:</w:t>
+      </w:r>
+    </w:p>
+    <w:p>
+      <w:pPr>
+        <w:pStyle w:val="ListParagraph"/>
+        <w:numPr>
+          <w:ilvl w:val="0"/>
+          <w:numId w:val="2"/>
+        </w:numPr>
+        <w:spacing w:after="100"/>
+      </w:pPr>
+      <w:r>
+        <w:rPr>
+          <w:sz w:val="22"/>
+          <w:szCs w:val="22"/>
+        </w:rPr>
+        <w:t xml:space="preserve">Self/Manager Balance — how much weight the employee's own self-review score carries versus their manager's assessment when the system suggests a final score. The default is 20% self / 80% manager; adjust the slider if this department should weigh things differently.</w:t>
+      </w:r>
+    </w:p>
+    <w:p>
+      <w:pPr>
+        <w:pStyle w:val="ListParagraph"/>
+        <w:numPr>
+          <w:ilvl w:val="0"/>
+          <w:numId w:val="2"/>
+        </w:numPr>
+        <w:spacing w:after="100"/>
+      </w:pPr>
+      <w:r>
+        <w:rPr>
+          <w:sz w:val="22"/>
+          <w:szCs w:val="22"/>
+        </w:rPr>
+        <w:t xml:space="preserve">Gap Alert Threshold — how many points of difference between the self-review score and the manager's score triggers a flag for your attention (default: 15 points).</w:t>
+      </w:r>
+    </w:p>
+    <w:p>
+      <w:pPr>
+        <w:pStyle w:val="Heading2"/>
+        <w:spacing w:after="150" w:before="300"/>
+      </w:pPr>
+      <w:r>
+        <w:rPr>
+          <w:b/>
+          <w:bCs/>
+          <w:color w:val="1F4E78"/>
+          <w:sz w:val="26"/>
+          <w:szCs w:val="26"/>
+        </w:rPr>
+        <w:t xml:space="preserve">Step 8 — Save</w:t>
+      </w:r>
+    </w:p>
+    <w:p>
+      <w:pPr>
+        <w:spacing w:after="160"/>
+      </w:pPr>
+      <w:r>
+        <w:rPr>
+          <w:sz w:val="22"/>
+          <w:szCs w:val="22"/>
+        </w:rPr>
+        <w:t xml:space="preserve">Click "Create Template" (or "Update Template" if one already exists for this department). That's it — the template, its reviewer chain, and its scoring rules are all live for the next appraisal cycle.</w:t>
       </w:r>
     </w:p>
     <w:p>
@@ -686,6 +839,57 @@
           <w:szCs w:val="22"/>
         </w:rPr>
         <w:t xml:space="preserve">The system calculates each question's score using your weighting, then averages up to a KPI score, then to an overall score — automatically.</w:t>
+      </w:r>
+    </w:p>
+    <w:p>
+      <w:pPr>
+        <w:pStyle w:val="ListParagraph"/>
+        <w:numPr>
+          <w:ilvl w:val="0"/>
+          <w:numId w:val="3"/>
+        </w:numPr>
+        <w:spacing w:after="140"/>
+      </w:pPr>
+      <w:r>
+        <w:rPr>
+          <w:sz w:val="22"/>
+          <w:szCs w:val="22"/>
+        </w:rPr>
+        <w:t xml:space="preserve">The appraisal is routed through exactly the reviewer stages you enabled — Manager, then Department Head and/or HR if turned on, then your final sign-off.</w:t>
+      </w:r>
+    </w:p>
+    <w:p>
+      <w:pPr>
+        <w:pStyle w:val="ListParagraph"/>
+        <w:numPr>
+          <w:ilvl w:val="0"/>
+          <w:numId w:val="3"/>
+        </w:numPr>
+        <w:spacing w:after="140"/>
+      </w:pPr>
+      <w:r>
+        <w:rPr>
+          <w:sz w:val="22"/>
+          <w:szCs w:val="22"/>
+        </w:rPr>
+        <w:t xml:space="preserve">If the self-review and manager scores differ by more than your gap threshold, the packet is flagged for your attention.</w:t>
+      </w:r>
+    </w:p>
+    <w:p>
+      <w:pPr>
+        <w:pStyle w:val="ListParagraph"/>
+        <w:numPr>
+          <w:ilvl w:val="0"/>
+          <w:numId w:val="3"/>
+        </w:numPr>
+        <w:spacing w:after="140"/>
+      </w:pPr>
+      <w:r>
+        <w:rPr>
+          <w:sz w:val="22"/>
+          <w:szCs w:val="22"/>
+        </w:rPr>
+        <w:t xml:space="preserve">When you finalize the appraisal, the suggested final score reflects the self/manager balance you set for that department — not a fixed 20/80 split.</w:t>
       </w:r>
     </w:p>
     <w:p>
@@ -712,7 +916,7 @@
           <w:sz w:val="21"/>
           <w:szCs w:val="21"/>
         </w:rPr>
-        <w:t xml:space="preserve">A template only applies to appraisal cycles started after it's created. Employees already mid-cycle when you save a template will finish their current appraisal on the old question set — this protects appraisals already in progress from being disrupted.</w:t>
+        <w:t xml:space="preserve">A template only applies to appraisal cycles started after it's created. Employees already mid-cycle when you save a template will finish their current appraisal on the old rules — this protects appraisals already in progress from being disrupted.</w:t>
       </w:r>
     </w:p>
     <w:p>
@@ -728,35 +932,7 @@
           <w:sz w:val="32"/>
           <w:szCs w:val="32"/>
         </w:rPr>
-        <w:t xml:space="preserve">5. What's Not Live Yet</w:t>
-      </w:r>
-    </w:p>
-    <w:p>
-      <w:pPr>
-        <w:spacing w:after="160"/>
-      </w:pPr>
-      <w:r>
-        <w:rPr>
-          <w:sz w:val="22"/>
-          <w:szCs w:val="22"/>
-        </w:rPr>
-        <w:t xml:space="preserve">You'll notice a few additional settings in the builder — Reviewer Chain toggles (Manager/Department Head/HR review), the self-review vs. manager-review score balance slider, and the gap alert threshold. These are saved when you click save, but they don't yet change how appraisals are routed or scored — that part of the system is still being built. For now, focus on the KPIs and questions, which are fully live.</w:t>
-      </w:r>
-    </w:p>
-    <w:p>
-      <w:pPr>
-        <w:pStyle w:val="Heading1"/>
-        <w:spacing w:after="200" w:before="400"/>
-      </w:pPr>
-      <w:r>
-        <w:rPr>
-          <w:b/>
-          <w:bCs/>
-          <w:color w:val="1F4E78"/>
-          <w:sz w:val="32"/>
-          <w:szCs w:val="32"/>
-        </w:rPr>
-        <w:t xml:space="preserve">6. Recommended First Steps</w:t>
+        <w:t xml:space="preserve">5. Recommended First Steps</w:t>
       </w:r>
     </w:p>
     <w:p>

</xml_diff>